<commit_message>
Ban cap nhat lại Test_Case 1.0
</commit_message>
<xml_diff>
--- a/Test_Case/Test Case Specification.docx
+++ b/Test_Case/Test Case Specification.docx
@@ -26,7 +26,33 @@
           <w:sz w:val="28"/>
           <w:szCs w:val="28"/>
         </w:rPr>
-        <w:t xml:space="preserve"> Hệ Thống Tưới Cây Tự Động</w:t>
+        <w:t xml:space="preserve"> </w:t>
+      </w:r>
+      <w:r>
+        <w:rPr>
+          <w:rFonts w:asciiTheme="majorHAnsi" w:hAnsiTheme="majorHAnsi" w:cstheme="majorHAnsi"/>
+          <w:sz w:val="28"/>
+          <w:szCs w:val="28"/>
+          <w:lang w:val="en-US"/>
+        </w:rPr>
+        <w:t xml:space="preserve">Thiết Kế </w:t>
+      </w:r>
+      <w:r>
+        <w:rPr>
+          <w:rFonts w:asciiTheme="majorHAnsi" w:hAnsiTheme="majorHAnsi" w:cstheme="majorHAnsi"/>
+          <w:sz w:val="28"/>
+          <w:szCs w:val="28"/>
+        </w:rPr>
+        <w:t>Hệ Thống Tưới Cây Tự Động</w:t>
+      </w:r>
+      <w:r>
+        <w:rPr>
+          <w:rFonts w:asciiTheme="majorHAnsi" w:hAnsiTheme="majorHAnsi" w:cstheme="majorHAnsi"/>
+          <w:sz w:val="28"/>
+          <w:szCs w:val="28"/>
+          <w:lang w:val="en-US"/>
+        </w:rPr>
+        <w:t xml:space="preserve"> Từ Xa</w:t>
       </w:r>
       <w:r>
         <w:rPr>
@@ -110,6 +136,13 @@
     </w:p>
     <w:sdt>
       <w:sdtPr>
+        <w:rPr>
+          <w:rFonts w:asciiTheme="minorHAnsi" w:eastAsiaTheme="minorHAnsi" w:hAnsiTheme="minorHAnsi" w:cstheme="minorBidi"/>
+          <w:color w:val="auto"/>
+          <w:sz w:val="22"/>
+          <w:szCs w:val="22"/>
+          <w:lang w:val="vi-VN"/>
+        </w:rPr>
         <w:id w:val="1494917591"/>
         <w:docPartObj>
           <w:docPartGallery w:val="Table of Contents"/>
@@ -118,14 +151,9 @@
       </w:sdtPr>
       <w:sdtEndPr>
         <w:rPr>
-          <w:rFonts w:asciiTheme="minorHAnsi" w:eastAsiaTheme="minorHAnsi" w:hAnsiTheme="minorHAnsi" w:cstheme="minorBidi"/>
           <w:b/>
           <w:bCs/>
           <w:noProof/>
-          <w:color w:val="auto"/>
-          <w:sz w:val="22"/>
-          <w:szCs w:val="22"/>
-          <w:lang w:val="vi-VN"/>
         </w:rPr>
       </w:sdtEndPr>
       <w:sdtContent>
@@ -11336,8 +11364,45 @@
                       <w:rFonts w:asciiTheme="majorHAnsi" w:hAnsiTheme="majorHAnsi" w:cstheme="majorHAnsi"/>
                       <w:sz w:val="28"/>
                       <w:szCs w:val="28"/>
+                      <w:lang w:val="en-US"/>
                     </w:rPr>
                   </w:pPr>
+                  <w:r>
+                    <w:rPr>
+                      <w:rStyle w:val="Strong"/>
+                      <w:rFonts w:asciiTheme="majorHAnsi" w:hAnsiTheme="majorHAnsi" w:cstheme="majorHAnsi"/>
+                      <w:sz w:val="28"/>
+                      <w:szCs w:val="28"/>
+                      <w:lang w:val="en-US"/>
+                    </w:rPr>
+                    <w:t>N</w:t>
+                  </w:r>
+                  <w:r>
+                    <w:rPr>
+                      <w:rStyle w:val="Strong"/>
+                    </w:rPr>
+                    <w:t>g</w:t>
+                  </w:r>
+                  <w:r>
+                    <w:rPr>
+                      <w:rStyle w:val="Strong"/>
+                      <w:lang w:val="en-US"/>
+                    </w:rPr>
+                    <w:t>u</w:t>
+                  </w:r>
+                  <w:r>
+                    <w:rPr>
+                      <w:rStyle w:val="Strong"/>
+                    </w:rPr>
+                    <w:t>yễn</w:t>
+                  </w:r>
+                  <w:r>
+                    <w:rPr>
+                      <w:rStyle w:val="Strong"/>
+                      <w:lang w:val="en-US"/>
+                    </w:rPr>
+                    <w:t xml:space="preserve"> Hữu Đạt</w:t>
+                  </w:r>
                 </w:p>
               </w:tc>
               <w:tc>
@@ -11352,8 +11417,19 @@
                       <w:rFonts w:asciiTheme="majorHAnsi" w:hAnsiTheme="majorHAnsi" w:cstheme="majorHAnsi"/>
                       <w:sz w:val="28"/>
                       <w:szCs w:val="28"/>
+                      <w:lang w:val="en-US"/>
                     </w:rPr>
                   </w:pPr>
+                  <w:r>
+                    <w:rPr>
+                      <w:rStyle w:val="Strong"/>
+                      <w:rFonts w:asciiTheme="majorHAnsi" w:hAnsiTheme="majorHAnsi" w:cstheme="majorHAnsi"/>
+                      <w:sz w:val="28"/>
+                      <w:szCs w:val="28"/>
+                      <w:lang w:val="en-US"/>
+                    </w:rPr>
+                    <w:t>Nhóm trưởng</w:t>
+                  </w:r>
                 </w:p>
               </w:tc>
               <w:tc>
@@ -11368,8 +11444,19 @@
                       <w:rFonts w:asciiTheme="majorHAnsi" w:hAnsiTheme="majorHAnsi" w:cstheme="majorHAnsi"/>
                       <w:sz w:val="28"/>
                       <w:szCs w:val="28"/>
+                      <w:lang w:val="en-US"/>
                     </w:rPr>
                   </w:pPr>
+                  <w:r>
+                    <w:rPr>
+                      <w:rStyle w:val="Strong"/>
+                      <w:rFonts w:asciiTheme="majorHAnsi" w:hAnsiTheme="majorHAnsi" w:cstheme="majorHAnsi"/>
+                      <w:sz w:val="28"/>
+                      <w:szCs w:val="28"/>
+                      <w:lang w:val="en-US"/>
+                    </w:rPr>
+                    <w:t>09/04/2025</w:t>
+                  </w:r>
                 </w:p>
               </w:tc>
             </w:tr>
@@ -11624,11 +11711,42 @@
       </w:r>
       <w:r>
         <w:rPr>
+          <w:rStyle w:val="Strong"/>
+          <w:rFonts w:asciiTheme="majorHAnsi" w:hAnsiTheme="majorHAnsi" w:cstheme="majorHAnsi"/>
+          <w:sz w:val="28"/>
+          <w:szCs w:val="28"/>
+          <w:lang w:val="en-US"/>
+        </w:rPr>
+        <w:t xml:space="preserve"> </w:t>
+      </w:r>
+      <w:r>
+        <w:rPr>
+          <w:rStyle w:val="Strong"/>
+          <w:rFonts w:asciiTheme="majorHAnsi" w:hAnsiTheme="majorHAnsi" w:cstheme="majorHAnsi"/>
+          <w:b w:val="0"/>
+          <w:bCs w:val="0"/>
+          <w:sz w:val="28"/>
+          <w:szCs w:val="28"/>
+          <w:lang w:val="en-US"/>
+        </w:rPr>
+        <w:t>Thiết Kế</w:t>
+      </w:r>
+      <w:r>
+        <w:rPr>
           <w:rFonts w:asciiTheme="majorHAnsi" w:hAnsiTheme="majorHAnsi" w:cstheme="majorHAnsi"/>
           <w:sz w:val="28"/>
           <w:szCs w:val="28"/>
         </w:rPr>
         <w:t xml:space="preserve"> Hệ Thống Tưới Cây Tự Động</w:t>
+      </w:r>
+      <w:r>
+        <w:rPr>
+          <w:rFonts w:asciiTheme="majorHAnsi" w:hAnsiTheme="majorHAnsi" w:cstheme="majorHAnsi"/>
+          <w:sz w:val="28"/>
+          <w:szCs w:val="28"/>
+          <w:lang w:val="en-US"/>
+        </w:rPr>
+        <w:t xml:space="preserve"> Từ Xa</w:t>
       </w:r>
       <w:r>
         <w:rPr>

</xml_diff>